<commit_message>
Batch N docs: D-044, KI-025 narrowed, evidence (278/278, 8/8 mutants), progress report refreshed
Co-authored-by: arena-agent <297053741+arena-agent@users.noreply.github.com>
</commit_message>
<xml_diff>
--- a/Docs/progress report.docx
+++ b/Docs/progress report.docx
@@ -40,7 +40,7 @@
                 <w:sz w:val="15"/>
               </w:rPr>
               <w:br/>
-              <w:t>Progress Snapshot  •  Batch M  •  21 Oct 2026</w:t>
+              <w:t>Progress Snapshot  •  Batch N  •  21 Oct 2026</w:t>
             </w:r>
           </w:p>
         </w:tc>
@@ -132,7 +132,7 @@
           <w:color w:val="666666"/>
           <w:sz w:val="18"/>
         </w:rPr>
-        <w:t xml:space="preserve">  •  verified headless 266/266  •  Unity host &amp; bake remaining</w:t>
+        <w:t xml:space="preserve">  •  verified headless 278/278  •  Unity host &amp; bake remaining</w:t>
       </w:r>
     </w:p>
     <w:p>
@@ -170,7 +170,7 @@
           <w:color w:val="222222"/>
           <w:sz w:val="17"/>
         </w:rPr>
-        <w:t>stages finished:{M0 Foundation — Unity 6.3 LTS project, URP, asmdefs, Bootstrap/Title scenes, input &amp; build scripts (domain Verified headless; APK fix D-038 ready for rebuild) • M1 Vehicle proving ground — Scout S1 powertrain, fuel/damage/water/mud math Verified headless (WheelCollider/Cam in Unity is Implemented · parse-checked) • M2 Forest vertical slice — campaign session, atomic save/banking, exploration map, Q01–Q04 + hub travel &amp; camp storage (Batches C/J) and M4 wiring — 20 missions, contracts, 20 research tiers, vehicles/items all Verified headless 266/266} and stages in progress:{M3 World pipeline — deterministic hash/PRNG, heightfield, seam checks, scatter placer &amp; streaming planner Verified headless 164/164; WorldStreamer MonoBehaviour host, real-terrain scatter, full-mainland bake &amp; route validation still to write/test on device} and stages yet to start:{M5 Content &amp; assets — five biomes final art/audio &amp; UI polish (placeholders in ASSET_MANIFEST.csv) • M6 Optimization &amp; usability — 30/60 FPS, thermal, accessibility on Moto G45 • M7 Release candidate — clean builds, save migrations, airplane-mode suite &amp; Play Store audit}</w:t>
+        <w:t>stages finished:{M0 Foundation — Unity 6.3 LTS project, URP, asmdefs, Bootstrap/Title scenes, input &amp; build scripts (domain Verified headless; APK fix D-038 ready for rebuild) • M1 Vehicle proving ground — Scout S1 powertrain, fuel/damage/water/mud math Verified headless (WheelCollider/Cam in Unity is Implemented · parse-checked) • M2 Forest vertical slice — campaign session, atomic save/banking, exploration map, Q01–Q04 + hub travel &amp; camp storage (Batches C/J) and M4 wiring — 20 missions, contracts, 20 research tiers, vehicles/items all Verified headless 278/278} and stages in progress:{M3 World pipeline — deterministic hash/PRNG, heightfield, seam checks, scatter placer &amp; streaming planner Verified headless 164/164; WorldStreamer MonoBehaviour host, real-terrain scatter, full-mainland bake &amp; route validation still to write/test on device} and stages yet to start:{M5 Content &amp; assets — five biomes final art/audio &amp; UI polish (placeholders in ASSET_MANIFEST.csv) • M6 Optimization &amp; usability — 30/60 FPS, thermal, accessibility on Moto G45 • M7 Release candidate — clean builds, save migrations, airplane-mode suite &amp; Play Store audit}</w:t>
       </w:r>
     </w:p>
     <w:p>
@@ -657,7 +657,7 @@
                 <w:color w:val="222222"/>
                 <w:sz w:val="13"/>
               </w:rPr>
-              <w:t>Finished — Campaign Verified headless 266/266; map/reveal, supplies/selling, hub logistics &amp; arbitrage fixed (Batches D/L/M); device 30-min playtest still required</w:t>
+              <w:t>Finished — Campaign Verified headless 278/278; map/reveal, supplies/selling, hub logistics &amp; arbitrage fixed (Batches D/L/M); device 30-min playtest still required</w:t>
             </w:r>
           </w:p>
         </w:tc>
@@ -1280,7 +1280,7 @@
           <w:color w:val="333333"/>
           <w:sz w:val="15"/>
         </w:rPr>
-        <w:t>Headless C# (Roslyn 3.9, C#9, -warn:4): 0 warnings — 47 engine-free files + 30 Unity files syntax-checked — 266/266 EditMode tests PASS (Logs/headless/EditMode.headless.xml)</w:t>
+        <w:t>Headless C# (Roslyn 3.9, C#9, -warn:4): 0 warnings — 47 engine-free files + 30 Unity files syntax-checked — 278/278 EditMode tests PASS (Logs/headless/EditMode.headless.xml)</w:t>
       </w:r>
     </w:p>
     <w:p>
@@ -1295,7 +1295,7 @@
           <w:color w:val="333333"/>
           <w:sz w:val="15"/>
         </w:rPr>
-        <w:t>Content &amp; formulas: validate_content.py PASS • formula_checks.py PASS (35 invariants) • economy_sim.py PASS (no deadlocks, no arbitrage) — 188/188 earlier, 266/266 now</w:t>
+        <w:t>Content &amp; formulas: validate_content.py PASS • formula_checks.py PASS (35 invariants) • economy_sim.py PASS (no deadlocks, no arbitrage) — 188/188 earlier, 278/278 now</w:t>
       </w:r>
     </w:p>
     <w:p>
@@ -1469,7 +1469,7 @@
           <w:color w:val="999999"/>
           <w:sz w:val="12"/>
         </w:rPr>
-        <w:t>Wayfinder  •  progress report  •  generated 21 Oct 2026 08:49   •  branch arena/5fb9f74d-wayfinder •  blueprint v1.0 §21.2 → IMPLEMENTATION_STATUS.md Batch M (21 Oct 2026)  •  headless 266/266 PASS</w:t>
+        <w:t>Wayfinder  •  progress report  •  generated 21 Oct 2026 09:05   •  branch arena/5fb9f74d-wayfinder •  blueprint v1.0 §21.2 → IMPLEMENTATION_STATUS.md Batch N (21 Oct 2026)  •  headless 278/278 PASS</w:t>
       </w:r>
     </w:p>
     <w:sectPr>

</xml_diff>